<commit_message>
Documentación: verificación por código, recuperación de contraseña y seguridad de la sesión
Co-Authored-By: Claude Opus 5.5 <noreply@anthropic.com>
Claude-Session: https://claude.ai/code/session_01EEp2R75HwKA2y9bhQhk5yV
</commit_message>
<xml_diff>
--- a/docs/Manual_Instalacion_Spotly.docx
+++ b/docs/Manual_Instalacion_Spotly.docx
@@ -5048,7 +5048,7 @@
                 <w:sz w:val="18"/>
                 <w:szCs w:val="18"/>
               </w:rPr>
-              <w:t xml:space="preserve">Pruebas automatizadas con Vitest (61 pruebas).</w:t>
+              <w:t xml:space="preserve">Pruebas automatizadas con Vitest (88 pruebas).</w:t>
             </w:r>
           </w:p>
         </w:tc>
@@ -6533,7 +6533,7 @@
           <w:sz w:val="22"/>
           <w:szCs w:val="22"/>
         </w:rPr>
-        <w:t xml:space="preserve">Para desarrollo puedes desactivar </w:t>
+        <w:t xml:space="preserve">Deja activo </w:t>
       </w:r>
       <w:r>
         <w:rPr>
@@ -6551,7 +6551,7 @@
           <w:sz w:val="22"/>
           <w:szCs w:val="22"/>
         </w:rPr>
-        <w:t xml:space="preserve"> y así entrar sin esperar el correo. En producción debe quedar activo.</w:t>
+        <w:t xml:space="preserve">: Spotly exige verificar el correo con un código antes de entrar (ver 4.5 y 4.6).</w:t>
       </w:r>
     </w:p>
     <w:p>
@@ -6978,7 +6978,614 @@
           <w:sz w:val="25"/>
           <w:szCs w:val="25"/>
         </w:rPr>
-        <w:t xml:space="preserve">4.5 Obtener las llaves del proyecto</w:t>
+        <w:t xml:space="preserve">4.5 Seguridad de acceso en Supabase</w:t>
+      </w:r>
+    </w:p>
+    <w:p>
+      <w:pPr>
+        <w:spacing w:after="140" w:line="276"/>
+        <w:jc w:val="both"/>
+      </w:pPr>
+      <w:r>
+        <w:rPr>
+          <w:rFonts w:ascii="Arial" w:cs="Arial" w:eastAsia="Arial" w:hAnsi="Arial"/>
+          <w:sz w:val="22"/>
+          <w:szCs w:val="22"/>
+        </w:rPr>
+        <w:t xml:space="preserve">Spotly exige verificar el correo con un código y permite recuperar la contraseña con un enlace de un solo uso. En </w:t>
+      </w:r>
+      <w:r>
+        <w:rPr>
+          <w:rFonts w:ascii="Arial" w:cs="Arial" w:eastAsia="Arial" w:hAnsi="Arial"/>
+          <w:b/>
+          <w:bCs/>
+          <w:sz w:val="22"/>
+          <w:szCs w:val="22"/>
+        </w:rPr>
+        <w:t xml:space="preserve">Authentication</w:t>
+      </w:r>
+      <w:r>
+        <w:rPr>
+          <w:rFonts w:ascii="Arial" w:cs="Arial" w:eastAsia="Arial" w:hAnsi="Arial"/>
+          <w:sz w:val="22"/>
+          <w:szCs w:val="22"/>
+        </w:rPr>
+        <w:t xml:space="preserve">:</w:t>
+      </w:r>
+    </w:p>
+    <w:p>
+      <w:pPr>
+        <w:pStyle w:val="ListParagraph"/>
+        <w:numPr>
+          <w:ilvl w:val="0"/>
+          <w:numId w:val="4"/>
+        </w:numPr>
+        <w:spacing w:after="60" w:line="276"/>
+        <w:jc w:val="both"/>
+      </w:pPr>
+      <w:r>
+        <w:rPr>
+          <w:rFonts w:ascii="Arial" w:cs="Arial" w:eastAsia="Arial" w:hAnsi="Arial"/>
+          <w:b/>
+          <w:bCs/>
+          <w:sz w:val="22"/>
+          <w:szCs w:val="22"/>
+        </w:rPr>
+        <w:t xml:space="preserve">Sign In / Providers → Email:</w:t>
+      </w:r>
+      <w:r>
+        <w:rPr>
+          <w:rFonts w:ascii="Arial" w:cs="Arial" w:eastAsia="Arial" w:hAnsi="Arial"/>
+          <w:sz w:val="22"/>
+          <w:szCs w:val="22"/>
+        </w:rPr>
+        <w:t xml:space="preserve"> activa </w:t>
+      </w:r>
+      <w:r>
+        <w:rPr>
+          <w:rFonts w:ascii="Arial" w:cs="Arial" w:eastAsia="Arial" w:hAnsi="Arial"/>
+          <w:b/>
+          <w:bCs/>
+          <w:sz w:val="22"/>
+          <w:szCs w:val="22"/>
+        </w:rPr>
+        <w:t xml:space="preserve">Confirm email</w:t>
+      </w:r>
+      <w:r>
+        <w:rPr>
+          <w:rFonts w:ascii="Arial" w:cs="Arial" w:eastAsia="Arial" w:hAnsi="Arial"/>
+          <w:sz w:val="22"/>
+          <w:szCs w:val="22"/>
+        </w:rPr>
+        <w:t xml:space="preserve">; deja </w:t>
+      </w:r>
+      <w:r>
+        <w:rPr>
+          <w:rFonts w:ascii="Arial" w:cs="Arial" w:eastAsia="Arial" w:hAnsi="Arial"/>
+          <w:b/>
+          <w:bCs/>
+          <w:sz w:val="22"/>
+          <w:szCs w:val="22"/>
+        </w:rPr>
+        <w:t xml:space="preserve">Email OTP Length</w:t>
+      </w:r>
+      <w:r>
+        <w:rPr>
+          <w:rFonts w:ascii="Arial" w:cs="Arial" w:eastAsia="Arial" w:hAnsi="Arial"/>
+          <w:sz w:val="22"/>
+          <w:szCs w:val="22"/>
+        </w:rPr>
+        <w:t xml:space="preserve"> en 6 y </w:t>
+      </w:r>
+      <w:r>
+        <w:rPr>
+          <w:rFonts w:ascii="Arial" w:cs="Arial" w:eastAsia="Arial" w:hAnsi="Arial"/>
+          <w:b/>
+          <w:bCs/>
+          <w:sz w:val="22"/>
+          <w:szCs w:val="22"/>
+        </w:rPr>
+        <w:t xml:space="preserve">Email OTP Expiration</w:t>
+      </w:r>
+      <w:r>
+        <w:rPr>
+          <w:rFonts w:ascii="Arial" w:cs="Arial" w:eastAsia="Arial" w:hAnsi="Arial"/>
+          <w:sz w:val="22"/>
+          <w:szCs w:val="22"/>
+        </w:rPr>
+        <w:t xml:space="preserve"> en 900 segundos.</w:t>
+      </w:r>
+    </w:p>
+    <w:p>
+      <w:pPr>
+        <w:pStyle w:val="ListParagraph"/>
+        <w:numPr>
+          <w:ilvl w:val="0"/>
+          <w:numId w:val="4"/>
+        </w:numPr>
+        <w:spacing w:after="60" w:line="276"/>
+        <w:jc w:val="both"/>
+      </w:pPr>
+      <w:r>
+        <w:rPr>
+          <w:rFonts w:ascii="Arial" w:cs="Arial" w:eastAsia="Arial" w:hAnsi="Arial"/>
+          <w:b/>
+          <w:bCs/>
+          <w:sz w:val="22"/>
+          <w:szCs w:val="22"/>
+        </w:rPr>
+        <w:t xml:space="preserve">Password requirements:</w:t>
+      </w:r>
+      <w:r>
+        <w:rPr>
+          <w:rFonts w:ascii="Arial" w:cs="Arial" w:eastAsia="Arial" w:hAnsi="Arial"/>
+          <w:sz w:val="22"/>
+          <w:szCs w:val="22"/>
+        </w:rPr>
+        <w:t xml:space="preserve"> mínimo 8 caracteres con minúsculas, mayúsculas y dígitos. En plan Pro activa </w:t>
+      </w:r>
+      <w:r>
+        <w:rPr>
+          <w:rFonts w:ascii="Arial" w:cs="Arial" w:eastAsia="Arial" w:hAnsi="Arial"/>
+          <w:b/>
+          <w:bCs/>
+          <w:sz w:val="22"/>
+          <w:szCs w:val="22"/>
+        </w:rPr>
+        <w:t xml:space="preserve">Prevent use of leaked passwords</w:t>
+      </w:r>
+      <w:r>
+        <w:rPr>
+          <w:rFonts w:ascii="Arial" w:cs="Arial" w:eastAsia="Arial" w:hAnsi="Arial"/>
+          <w:sz w:val="22"/>
+          <w:szCs w:val="22"/>
+        </w:rPr>
+        <w:t xml:space="preserve">.</w:t>
+      </w:r>
+    </w:p>
+    <w:p>
+      <w:pPr>
+        <w:pStyle w:val="ListParagraph"/>
+        <w:numPr>
+          <w:ilvl w:val="0"/>
+          <w:numId w:val="4"/>
+        </w:numPr>
+        <w:spacing w:after="60" w:line="276"/>
+        <w:jc w:val="both"/>
+      </w:pPr>
+      <w:r>
+        <w:rPr>
+          <w:rFonts w:ascii="Arial" w:cs="Arial" w:eastAsia="Arial" w:hAnsi="Arial"/>
+          <w:b/>
+          <w:bCs/>
+          <w:sz w:val="22"/>
+          <w:szCs w:val="22"/>
+        </w:rPr>
+        <w:t xml:space="preserve">URL Configuration → Redirect URLs:</w:t>
+      </w:r>
+      <w:r>
+        <w:rPr>
+          <w:rFonts w:ascii="Arial" w:cs="Arial" w:eastAsia="Arial" w:hAnsi="Arial"/>
+          <w:sz w:val="22"/>
+          <w:szCs w:val="22"/>
+        </w:rPr>
+        <w:t xml:space="preserve"> agrega </w:t>
+      </w:r>
+      <w:r>
+        <w:rPr>
+          <w:rFonts w:ascii="Consolas" w:cs="Consolas" w:eastAsia="Consolas" w:hAnsi="Consolas"/>
+          <w:color w:val="9F1239"/>
+          <w:sz w:val="20"/>
+          <w:szCs w:val="20"/>
+        </w:rPr>
+        <w:t xml:space="preserve">https://TU-DOMINIO/restablecer-contrasena</w:t>
+      </w:r>
+      <w:r>
+        <w:rPr>
+          <w:rFonts w:ascii="Arial" w:cs="Arial" w:eastAsia="Arial" w:hAnsi="Arial"/>
+          <w:sz w:val="22"/>
+          <w:szCs w:val="22"/>
+        </w:rPr>
+        <w:t xml:space="preserve"> y </w:t>
+      </w:r>
+      <w:r>
+        <w:rPr>
+          <w:rFonts w:ascii="Consolas" w:cs="Consolas" w:eastAsia="Consolas" w:hAnsi="Consolas"/>
+          <w:color w:val="9F1239"/>
+          <w:sz w:val="20"/>
+          <w:szCs w:val="20"/>
+        </w:rPr>
+        <w:t xml:space="preserve">https://TU-DOMINIO/verificar-correo</w:t>
+      </w:r>
+      <w:r>
+        <w:rPr>
+          <w:rFonts w:ascii="Arial" w:cs="Arial" w:eastAsia="Arial" w:hAnsi="Arial"/>
+          <w:sz w:val="22"/>
+          <w:szCs w:val="22"/>
+        </w:rPr>
+        <w:t xml:space="preserve">.</w:t>
+      </w:r>
+    </w:p>
+    <w:p>
+      <w:pPr>
+        <w:spacing w:after="140" w:line="276"/>
+        <w:jc w:val="both"/>
+      </w:pPr>
+      <w:r>
+        <w:rPr>
+          <w:rFonts w:ascii="Arial" w:cs="Arial" w:eastAsia="Arial" w:hAnsi="Arial"/>
+          <w:sz w:val="22"/>
+          <w:szCs w:val="22"/>
+        </w:rPr>
+        <w:t xml:space="preserve">Si la base ya tenía datos, ejecuta además el parche no destructivo </w:t>
+      </w:r>
+      <w:r>
+        <w:rPr>
+          <w:rFonts w:ascii="Consolas" w:cs="Consolas" w:eastAsia="Consolas" w:hAnsi="Consolas"/>
+          <w:color w:val="9F1239"/>
+          <w:sz w:val="20"/>
+          <w:szCs w:val="20"/>
+        </w:rPr>
+        <w:t xml:space="preserve">supabase/patch-2026-10-27-seguridad-acceso.sql</w:t>
+      </w:r>
+      <w:r>
+        <w:rPr>
+          <w:rFonts w:ascii="Arial" w:cs="Arial" w:eastAsia="Arial" w:hAnsi="Arial"/>
+          <w:sz w:val="22"/>
+          <w:szCs w:val="22"/>
+        </w:rPr>
+        <w:t xml:space="preserve">.</w:t>
+      </w:r>
+    </w:p>
+    <w:p>
+      <w:pPr>
+        <w:pStyle w:val="Heading2"/>
+        <w:keepNext/>
+        <w:spacing w:after="120" w:before="240"/>
+      </w:pPr>
+      <w:r>
+        <w:rPr>
+          <w:rFonts w:ascii="Arial" w:cs="Arial" w:eastAsia="Arial" w:hAnsi="Arial"/>
+          <w:b/>
+          <w:bCs/>
+          <w:color w:val="1F3864"/>
+          <w:sz w:val="25"/>
+          <w:szCs w:val="25"/>
+        </w:rPr>
+        <w:t xml:space="preserve">4.6 Envío de correos</w:t>
+      </w:r>
+    </w:p>
+    <w:p>
+      <w:pPr>
+        <w:spacing w:after="140" w:line="276"/>
+        <w:jc w:val="both"/>
+      </w:pPr>
+      <w:r>
+        <w:rPr>
+          <w:rFonts w:ascii="Arial" w:cs="Arial" w:eastAsia="Arial" w:hAnsi="Arial"/>
+          <w:b/>
+          <w:bCs/>
+          <w:sz w:val="22"/>
+          <w:szCs w:val="22"/>
+        </w:rPr>
+        <w:t xml:space="preserve">Opción A (recomendada):</w:t>
+      </w:r>
+      <w:r>
+        <w:rPr>
+          <w:rFonts w:ascii="Arial" w:cs="Arial" w:eastAsia="Arial" w:hAnsi="Arial"/>
+          <w:sz w:val="22"/>
+          <w:szCs w:val="22"/>
+        </w:rPr>
+        <w:t xml:space="preserve"> crea una cuenta en Resend, verifica tu dominio y define </w:t>
+      </w:r>
+      <w:r>
+        <w:rPr>
+          <w:rFonts w:ascii="Consolas" w:cs="Consolas" w:eastAsia="Consolas" w:hAnsi="Consolas"/>
+          <w:color w:val="9F1239"/>
+          <w:sz w:val="20"/>
+          <w:szCs w:val="20"/>
+        </w:rPr>
+        <w:t xml:space="preserve">RESEND_API_KEY</w:t>
+      </w:r>
+      <w:r>
+        <w:rPr>
+          <w:rFonts w:ascii="Arial" w:cs="Arial" w:eastAsia="Arial" w:hAnsi="Arial"/>
+          <w:sz w:val="22"/>
+          <w:szCs w:val="22"/>
+        </w:rPr>
+        <w:t xml:space="preserve"> y </w:t>
+      </w:r>
+      <w:r>
+        <w:rPr>
+          <w:rFonts w:ascii="Consolas" w:cs="Consolas" w:eastAsia="Consolas" w:hAnsi="Consolas"/>
+          <w:color w:val="9F1239"/>
+          <w:sz w:val="20"/>
+          <w:szCs w:val="20"/>
+        </w:rPr>
+        <w:t xml:space="preserve">EMAIL_FROM</w:t>
+      </w:r>
+      <w:r>
+        <w:rPr>
+          <w:rFonts w:ascii="Arial" w:cs="Arial" w:eastAsia="Arial" w:hAnsi="Arial"/>
+          <w:sz w:val="22"/>
+          <w:szCs w:val="22"/>
+        </w:rPr>
+        <w:t xml:space="preserve">. Spotly envía sus propios correos con su marca.</w:t>
+      </w:r>
+    </w:p>
+    <w:p>
+      <w:pPr>
+        <w:spacing w:after="140" w:line="276"/>
+        <w:jc w:val="both"/>
+      </w:pPr>
+      <w:r>
+        <w:rPr>
+          <w:rFonts w:ascii="Arial" w:cs="Arial" w:eastAsia="Arial" w:hAnsi="Arial"/>
+          <w:b/>
+          <w:bCs/>
+          <w:sz w:val="22"/>
+          <w:szCs w:val="22"/>
+        </w:rPr>
+        <w:t xml:space="preserve">Opción B:</w:t>
+      </w:r>
+      <w:r>
+        <w:rPr>
+          <w:rFonts w:ascii="Arial" w:cs="Arial" w:eastAsia="Arial" w:hAnsi="Arial"/>
+          <w:sz w:val="22"/>
+          <w:szCs w:val="22"/>
+        </w:rPr>
+        <w:t xml:space="preserve"> usa los correos de Supabase. Configura un SMTP propio en </w:t>
+      </w:r>
+      <w:r>
+        <w:rPr>
+          <w:rFonts w:ascii="Arial" w:cs="Arial" w:eastAsia="Arial" w:hAnsi="Arial"/>
+          <w:b/>
+          <w:bCs/>
+          <w:sz w:val="22"/>
+          <w:szCs w:val="22"/>
+        </w:rPr>
+        <w:t xml:space="preserve">Authentication → Emails → SMTP Settings</w:t>
+      </w:r>
+      <w:r>
+        <w:rPr>
+          <w:rFonts w:ascii="Arial" w:cs="Arial" w:eastAsia="Arial" w:hAnsi="Arial"/>
+          <w:sz w:val="22"/>
+          <w:szCs w:val="22"/>
+        </w:rPr>
+        <w:t xml:space="preserve"> (el SMTP incluido solo envía a los miembros del equipo) y edita las plantillas: en </w:t>
+      </w:r>
+      <w:r>
+        <w:rPr>
+          <w:rFonts w:ascii="Arial" w:cs="Arial" w:eastAsia="Arial" w:hAnsi="Arial"/>
+          <w:b/>
+          <w:bCs/>
+          <w:sz w:val="22"/>
+          <w:szCs w:val="22"/>
+        </w:rPr>
+        <w:t xml:space="preserve">Confirm signup</w:t>
+      </w:r>
+      <w:r>
+        <w:rPr>
+          <w:rFonts w:ascii="Arial" w:cs="Arial" w:eastAsia="Arial" w:hAnsi="Arial"/>
+          <w:sz w:val="22"/>
+          <w:szCs w:val="22"/>
+        </w:rPr>
+        <w:t xml:space="preserve"> incluye </w:t>
+      </w:r>
+      <w:r>
+        <w:rPr>
+          <w:rFonts w:ascii="Consolas" w:cs="Consolas" w:eastAsia="Consolas" w:hAnsi="Consolas"/>
+          <w:color w:val="9F1239"/>
+          <w:sz w:val="20"/>
+          <w:szCs w:val="20"/>
+        </w:rPr>
+        <w:t xml:space="preserve">{{ .Token }}</w:t>
+      </w:r>
+      <w:r>
+        <w:rPr>
+          <w:rFonts w:ascii="Arial" w:cs="Arial" w:eastAsia="Arial" w:hAnsi="Arial"/>
+          <w:sz w:val="22"/>
+          <w:szCs w:val="22"/>
+        </w:rPr>
+        <w:t xml:space="preserve"> (el código) y en </w:t>
+      </w:r>
+      <w:r>
+        <w:rPr>
+          <w:rFonts w:ascii="Arial" w:cs="Arial" w:eastAsia="Arial" w:hAnsi="Arial"/>
+          <w:b/>
+          <w:bCs/>
+          <w:sz w:val="22"/>
+          <w:szCs w:val="22"/>
+        </w:rPr>
+        <w:t xml:space="preserve">Reset password</w:t>
+      </w:r>
+      <w:r>
+        <w:rPr>
+          <w:rFonts w:ascii="Arial" w:cs="Arial" w:eastAsia="Arial" w:hAnsi="Arial"/>
+          <w:sz w:val="22"/>
+          <w:szCs w:val="22"/>
+        </w:rPr>
+        <w:t xml:space="preserve"> usa el enlace </w:t>
+      </w:r>
+      <w:r>
+        <w:rPr>
+          <w:rFonts w:ascii="Consolas" w:cs="Consolas" w:eastAsia="Consolas" w:hAnsi="Consolas"/>
+          <w:color w:val="9F1239"/>
+          <w:sz w:val="20"/>
+          <w:szCs w:val="20"/>
+        </w:rPr>
+        <w:t xml:space="preserve">{{ .SiteURL }}/restablecer-contrasena?token_hash={{ .TokenHash }}&amp;type=recovery</w:t>
+      </w:r>
+      <w:r>
+        <w:rPr>
+          <w:rFonts w:ascii="Arial" w:cs="Arial" w:eastAsia="Arial" w:hAnsi="Arial"/>
+          <w:sz w:val="22"/>
+          <w:szCs w:val="22"/>
+        </w:rPr>
+        <w:t xml:space="preserve">. El texto completo de ambas plantillas está en </w:t>
+      </w:r>
+      <w:r>
+        <w:rPr>
+          <w:rFonts w:ascii="Consolas" w:cs="Consolas" w:eastAsia="Consolas" w:hAnsi="Consolas"/>
+          <w:color w:val="9F1239"/>
+          <w:sz w:val="20"/>
+          <w:szCs w:val="20"/>
+        </w:rPr>
+        <w:t xml:space="preserve">DEPLOYMENT_AND_SUPABASE_SETUP.md</w:t>
+      </w:r>
+      <w:r>
+        <w:rPr>
+          <w:rFonts w:ascii="Arial" w:cs="Arial" w:eastAsia="Arial" w:hAnsi="Arial"/>
+          <w:sz w:val="22"/>
+          <w:szCs w:val="22"/>
+        </w:rPr>
+        <w:t xml:space="preserve">.</w:t>
+      </w:r>
+    </w:p>
+    <w:tbl>
+      <w:tblPr>
+        <w:tblW w:type="dxa" w:w="9406"/>
+        <w:tblBorders>
+          <w:top w:val="single" w:color="auto" w:sz="4"/>
+          <w:left w:val="single" w:color="auto" w:sz="4"/>
+          <w:bottom w:val="single" w:color="auto" w:sz="4"/>
+          <w:right w:val="single" w:color="auto" w:sz="4"/>
+          <w:insideH w:val="single" w:color="auto" w:sz="4"/>
+          <w:insideV w:val="single" w:color="auto" w:sz="4"/>
+        </w:tblBorders>
+      </w:tblPr>
+      <w:tblGrid>
+        <w:gridCol w:w="9406"/>
+      </w:tblGrid>
+      <w:tr>
+        <w:trPr>
+          <w:cantSplit/>
+        </w:trPr>
+        <w:tc>
+          <w:tcPr>
+            <w:tcW w:type="dxa" w:w="9406"/>
+            <w:tcBorders>
+              <w:top w:val="none" w:color="FFFFFF" w:sz="0"/>
+              <w:left w:val="single" w:color="2F5597" w:sz="24"/>
+              <w:bottom w:val="none" w:color="FFFFFF" w:sz="0"/>
+              <w:right w:val="none" w:color="FFFFFF" w:sz="0"/>
+            </w:tcBorders>
+            <w:shd w:fill="EEF3FB" w:color="auto" w:val="clear"/>
+            <w:tcMar>
+              <w:top w:type="dxa" w:w="100"/>
+              <w:left w:type="dxa" w:w="180"/>
+              <w:bottom w:type="dxa" w:w="100"/>
+              <w:right w:type="dxa" w:w="180"/>
+            </w:tcMar>
+          </w:tcPr>
+          <w:p>
+            <w:pPr>
+              <w:spacing w:after="60"/>
+            </w:pPr>
+            <w:r>
+              <w:rPr>
+                <w:rFonts w:ascii="Arial" w:cs="Arial" w:eastAsia="Arial" w:hAnsi="Arial"/>
+                <w:b/>
+                <w:bCs/>
+                <w:color w:val="2F5597"/>
+                <w:sz w:val="20"/>
+                <w:szCs w:val="20"/>
+              </w:rPr>
+              <w:t xml:space="preserve">Cómo se protege la sesión</w:t>
+            </w:r>
+          </w:p>
+          <w:p>
+            <w:pPr>
+              <w:spacing w:after="40"/>
+            </w:pPr>
+            <w:r>
+              <w:rPr>
+                <w:rFonts w:ascii="Arial" w:cs="Arial" w:eastAsia="Arial" w:hAnsi="Arial"/>
+                <w:sz w:val="20"/>
+                <w:szCs w:val="20"/>
+              </w:rPr>
+              <w:t xml:space="preserve">Las contraseñas las guarda Supabase Auth solo como hash bcrypt (irreversible).</w:t>
+            </w:r>
+          </w:p>
+          <w:p>
+            <w:pPr>
+              <w:spacing w:after="40"/>
+            </w:pPr>
+            <w:r>
+              <w:rPr>
+                <w:rFonts w:ascii="Arial" w:cs="Arial" w:eastAsia="Arial" w:hAnsi="Arial"/>
+                <w:sz w:val="20"/>
+                <w:szCs w:val="20"/>
+              </w:rPr>
+              <w:t xml:space="preserve">La sesión larga vive en la cookie </w:t>
+            </w:r>
+            <w:r>
+              <w:rPr>
+                <w:rFonts w:ascii="Consolas" w:cs="Consolas" w:eastAsia="Consolas" w:hAnsi="Consolas"/>
+                <w:color w:val="9F1239"/>
+                <w:sz w:val="18"/>
+                <w:szCs w:val="18"/>
+              </w:rPr>
+              <w:t xml:space="preserve">spotly_rt</w:t>
+            </w:r>
+            <w:r>
+              <w:rPr>
+                <w:rFonts w:ascii="Arial" w:cs="Arial" w:eastAsia="Arial" w:hAnsi="Arial"/>
+                <w:sz w:val="20"/>
+                <w:szCs w:val="20"/>
+              </w:rPr>
+              <w:t xml:space="preserve"> (HttpOnly, Secure, SameSite=Strict, Path=/api/auth): JavaScript no puede leerla. El navegador solo guarda en memoria un token de 1 hora.</w:t>
+            </w:r>
+          </w:p>
+          <w:p>
+            <w:pPr>
+              <w:spacing w:after="40"/>
+            </w:pPr>
+            <w:r>
+              <w:rPr>
+                <w:rFonts w:ascii="Arial" w:cs="Arial" w:eastAsia="Arial" w:hAnsi="Arial"/>
+                <w:sz w:val="20"/>
+                <w:szCs w:val="20"/>
+              </w:rPr>
+              <w:t xml:space="preserve">Por eso la web y </w:t>
+            </w:r>
+            <w:r>
+              <w:rPr>
+                <w:rFonts w:ascii="Consolas" w:cs="Consolas" w:eastAsia="Consolas" w:hAnsi="Consolas"/>
+                <w:color w:val="9F1239"/>
+                <w:sz w:val="18"/>
+                <w:szCs w:val="18"/>
+              </w:rPr>
+              <w:t xml:space="preserve">/api</w:t>
+            </w:r>
+            <w:r>
+              <w:rPr>
+                <w:rFonts w:ascii="Arial" w:cs="Arial" w:eastAsia="Arial" w:hAnsi="Arial"/>
+                <w:sz w:val="20"/>
+                <w:szCs w:val="20"/>
+              </w:rPr>
+              <w:t xml:space="preserve"> deben estar en el mismo dominio (Vercel lo hace por defecto).</w:t>
+            </w:r>
+          </w:p>
+        </w:tc>
+      </w:tr>
+    </w:tbl>
+    <w:p>
+      <w:pPr>
+        <w:pStyle w:val="Heading2"/>
+        <w:keepNext/>
+        <w:spacing w:after="120" w:before="240"/>
+      </w:pPr>
+      <w:r>
+        <w:rPr>
+          <w:rFonts w:ascii="Arial" w:cs="Arial" w:eastAsia="Arial" w:hAnsi="Arial"/>
+          <w:b/>
+          <w:bCs/>
+          <w:color w:val="1F3864"/>
+          <w:sz w:val="25"/>
+          <w:szCs w:val="25"/>
+        </w:rPr>
+        <w:t xml:space="preserve">4.7 Obtener las llaves del proyecto</w:t>
       </w:r>
     </w:p>
     <w:p>
@@ -8943,7 +9550,23 @@
                 <w:sz w:val="16"/>
                 <w:szCs w:val="16"/>
               </w:rPr>
-              <w:t xml:space="preserve">PUBLIC_APP_URL</w:t>
+              <w:t xml:space="preserve">RESEND_API_KEY</w:t>
+            </w:r>
+            <w:r>
+              <w:rPr>
+                <w:rFonts w:ascii="Arial" w:cs="Arial" w:eastAsia="Arial" w:hAnsi="Arial"/>
+                <w:sz w:val="18"/>
+                <w:szCs w:val="18"/>
+              </w:rPr>
+              <w:t xml:space="preserve"> / </w:t>
+            </w:r>
+            <w:r>
+              <w:rPr>
+                <w:rFonts w:ascii="Consolas" w:cs="Consolas" w:eastAsia="Consolas" w:hAnsi="Consolas"/>
+                <w:sz w:val="16"/>
+                <w:szCs w:val="16"/>
+              </w:rPr>
+              <w:t xml:space="preserve">EMAIL_FROM</w:t>
             </w:r>
           </w:p>
         </w:tc>
@@ -8975,7 +9598,7 @@
                 <w:sz w:val="18"/>
                 <w:szCs w:val="18"/>
               </w:rPr>
-              <w:t xml:space="preserve">No</w:t>
+              <w:t xml:space="preserve">Recomendada</w:t>
             </w:r>
           </w:p>
         </w:tc>
@@ -9007,7 +9630,7 @@
                 <w:sz w:val="18"/>
                 <w:szCs w:val="18"/>
               </w:rPr>
-              <w:t xml:space="preserve">URL pública de la app para armar la dirección de retorno de Transbank. Por defecto se usa el dominio de la solicitud.</w:t>
+              <w:t xml:space="preserve">Envío de los correos de Spotly (código de verificación y enlace de recuperación) con Resend. Sin ella, los envía Supabase con sus plantillas (capítulo 4.6).</w:t>
             </w:r>
           </w:p>
         </w:tc>
@@ -9043,7 +9666,7 @@
                 <w:sz w:val="16"/>
                 <w:szCs w:val="16"/>
               </w:rPr>
-              <w:t xml:space="preserve">SITE_URL</w:t>
+              <w:t xml:space="preserve">PUBLIC_APP_URL</w:t>
             </w:r>
           </w:p>
         </w:tc>
@@ -9105,39 +9728,7 @@
                 <w:sz w:val="18"/>
                 <w:szCs w:val="18"/>
               </w:rPr>
-              <w:t xml:space="preserve">Dominio usado para generar </w:t>
-            </w:r>
-            <w:r>
-              <w:rPr>
-                <w:rFonts w:ascii="Consolas" w:cs="Consolas" w:eastAsia="Consolas" w:hAnsi="Consolas"/>
-                <w:sz w:val="16"/>
-                <w:szCs w:val="16"/>
-              </w:rPr>
-              <w:t xml:space="preserve">sitemap.xml</w:t>
-            </w:r>
-            <w:r>
-              <w:rPr>
-                <w:rFonts w:ascii="Arial" w:cs="Arial" w:eastAsia="Arial" w:hAnsi="Arial"/>
-                <w:sz w:val="18"/>
-                <w:szCs w:val="18"/>
-              </w:rPr>
-              <w:t xml:space="preserve"> y </w:t>
-            </w:r>
-            <w:r>
-              <w:rPr>
-                <w:rFonts w:ascii="Consolas" w:cs="Consolas" w:eastAsia="Consolas" w:hAnsi="Consolas"/>
-                <w:sz w:val="16"/>
-                <w:szCs w:val="16"/>
-              </w:rPr>
-              <w:t xml:space="preserve">robots.txt</w:t>
-            </w:r>
-            <w:r>
-              <w:rPr>
-                <w:rFonts w:ascii="Arial" w:cs="Arial" w:eastAsia="Arial" w:hAnsi="Arial"/>
-                <w:sz w:val="18"/>
-                <w:szCs w:val="18"/>
-              </w:rPr>
-              <w:t xml:space="preserve"> al compilar.</w:t>
+              <w:t xml:space="preserve">URL pública de la app para armar la dirección de retorno de Transbank. Por defecto se usa el dominio de la solicitud.</w:t>
             </w:r>
           </w:p>
         </w:tc>
@@ -9174,15 +9765,71 @@
                 <w:sz w:val="16"/>
                 <w:szCs w:val="16"/>
               </w:rPr>
-              <w:t xml:space="preserve">PORT</w:t>
-            </w:r>
-            <w:r>
-              <w:rPr>
-                <w:rFonts w:ascii="Arial" w:cs="Arial" w:eastAsia="Arial" w:hAnsi="Arial"/>
-                <w:sz w:val="18"/>
-                <w:szCs w:val="18"/>
-              </w:rPr>
-              <w:t xml:space="preserve"> / </w:t>
+              <w:t xml:space="preserve">SITE_URL</w:t>
+            </w:r>
+          </w:p>
+        </w:tc>
+        <w:tc>
+          <w:tcPr>
+            <w:tcW w:type="dxa" w:w="1505"/>
+            <w:tcBorders>
+              <w:top w:val="single" w:color="8EA9DB" w:sz="4"/>
+              <w:left w:val="single" w:color="8EA9DB" w:sz="4"/>
+              <w:bottom w:val="single" w:color="8EA9DB" w:sz="4"/>
+              <w:right w:val="single" w:color="8EA9DB" w:sz="4"/>
+            </w:tcBorders>
+            <w:shd w:fill="F2F6FC" w:color="auto" w:val="clear"/>
+            <w:tcMar>
+              <w:top w:type="dxa" w:w="50"/>
+              <w:left w:type="dxa" w:w="90"/>
+              <w:bottom w:type="dxa" w:w="50"/>
+              <w:right w:type="dxa" w:w="90"/>
+            </w:tcMar>
+            <w:vAlign w:val="center"/>
+          </w:tcPr>
+          <w:p>
+            <w:pPr>
+              <w:jc w:val="left"/>
+            </w:pPr>
+            <w:r>
+              <w:rPr>
+                <w:rFonts w:ascii="Arial" w:cs="Arial" w:eastAsia="Arial" w:hAnsi="Arial"/>
+                <w:sz w:val="18"/>
+                <w:szCs w:val="18"/>
+              </w:rPr>
+              <w:t xml:space="preserve">No</w:t>
+            </w:r>
+          </w:p>
+        </w:tc>
+        <w:tc>
+          <w:tcPr>
+            <w:tcW w:type="dxa" w:w="4703"/>
+            <w:tcBorders>
+              <w:top w:val="single" w:color="8EA9DB" w:sz="4"/>
+              <w:left w:val="single" w:color="8EA9DB" w:sz="4"/>
+              <w:bottom w:val="single" w:color="8EA9DB" w:sz="4"/>
+              <w:right w:val="single" w:color="8EA9DB" w:sz="4"/>
+            </w:tcBorders>
+            <w:shd w:fill="F2F6FC" w:color="auto" w:val="clear"/>
+            <w:tcMar>
+              <w:top w:type="dxa" w:w="50"/>
+              <w:left w:type="dxa" w:w="90"/>
+              <w:bottom w:type="dxa" w:w="50"/>
+              <w:right w:type="dxa" w:w="90"/>
+            </w:tcMar>
+            <w:vAlign w:val="center"/>
+          </w:tcPr>
+          <w:p>
+            <w:pPr>
+              <w:jc w:val="left"/>
+            </w:pPr>
+            <w:r>
+              <w:rPr>
+                <w:rFonts w:ascii="Arial" w:cs="Arial" w:eastAsia="Arial" w:hAnsi="Arial"/>
+                <w:sz w:val="18"/>
+                <w:szCs w:val="18"/>
+              </w:rPr>
+              <w:t xml:space="preserve">Dominio usado para generar </w:t>
             </w:r>
             <w:r>
               <w:rPr>
@@ -9190,71 +9837,15 @@
                 <w:sz w:val="16"/>
                 <w:szCs w:val="16"/>
               </w:rPr>
-              <w:t xml:space="preserve">NODE_ENV</w:t>
-            </w:r>
-          </w:p>
-        </w:tc>
-        <w:tc>
-          <w:tcPr>
-            <w:tcW w:type="dxa" w:w="1505"/>
-            <w:tcBorders>
-              <w:top w:val="single" w:color="8EA9DB" w:sz="4"/>
-              <w:left w:val="single" w:color="8EA9DB" w:sz="4"/>
-              <w:bottom w:val="single" w:color="8EA9DB" w:sz="4"/>
-              <w:right w:val="single" w:color="8EA9DB" w:sz="4"/>
-            </w:tcBorders>
-            <w:shd w:fill="F2F6FC" w:color="auto" w:val="clear"/>
-            <w:tcMar>
-              <w:top w:type="dxa" w:w="50"/>
-              <w:left w:type="dxa" w:w="90"/>
-              <w:bottom w:type="dxa" w:w="50"/>
-              <w:right w:type="dxa" w:w="90"/>
-            </w:tcMar>
-            <w:vAlign w:val="center"/>
-          </w:tcPr>
-          <w:p>
-            <w:pPr>
-              <w:jc w:val="left"/>
-            </w:pPr>
-            <w:r>
-              <w:rPr>
-                <w:rFonts w:ascii="Arial" w:cs="Arial" w:eastAsia="Arial" w:hAnsi="Arial"/>
-                <w:sz w:val="18"/>
-                <w:szCs w:val="18"/>
-              </w:rPr>
-              <w:t xml:space="preserve">No</w:t>
-            </w:r>
-          </w:p>
-        </w:tc>
-        <w:tc>
-          <w:tcPr>
-            <w:tcW w:type="dxa" w:w="4703"/>
-            <w:tcBorders>
-              <w:top w:val="single" w:color="8EA9DB" w:sz="4"/>
-              <w:left w:val="single" w:color="8EA9DB" w:sz="4"/>
-              <w:bottom w:val="single" w:color="8EA9DB" w:sz="4"/>
-              <w:right w:val="single" w:color="8EA9DB" w:sz="4"/>
-            </w:tcBorders>
-            <w:shd w:fill="F2F6FC" w:color="auto" w:val="clear"/>
-            <w:tcMar>
-              <w:top w:type="dxa" w:w="50"/>
-              <w:left w:type="dxa" w:w="90"/>
-              <w:bottom w:type="dxa" w:w="50"/>
-              <w:right w:type="dxa" w:w="90"/>
-            </w:tcMar>
-            <w:vAlign w:val="center"/>
-          </w:tcPr>
-          <w:p>
-            <w:pPr>
-              <w:jc w:val="left"/>
-            </w:pPr>
-            <w:r>
-              <w:rPr>
-                <w:rFonts w:ascii="Arial" w:cs="Arial" w:eastAsia="Arial" w:hAnsi="Arial"/>
-                <w:sz w:val="18"/>
-                <w:szCs w:val="18"/>
-              </w:rPr>
-              <w:t xml:space="preserve">Puerto del servidor local (3000) y modo (</w:t>
+              <w:t xml:space="preserve">sitemap.xml</w:t>
+            </w:r>
+            <w:r>
+              <w:rPr>
+                <w:rFonts w:ascii="Arial" w:cs="Arial" w:eastAsia="Arial" w:hAnsi="Arial"/>
+                <w:sz w:val="18"/>
+                <w:szCs w:val="18"/>
+              </w:rPr>
+              <w:t xml:space="preserve"> y </w:t>
             </w:r>
             <w:r>
               <w:rPr>
@@ -9262,31 +9853,15 @@
                 <w:sz w:val="16"/>
                 <w:szCs w:val="16"/>
               </w:rPr>
-              <w:t xml:space="preserve">development</w:t>
-            </w:r>
-            <w:r>
-              <w:rPr>
-                <w:rFonts w:ascii="Arial" w:cs="Arial" w:eastAsia="Arial" w:hAnsi="Arial"/>
-                <w:sz w:val="18"/>
-                <w:szCs w:val="18"/>
-              </w:rPr>
-              <w:t xml:space="preserve"> o </w:t>
-            </w:r>
-            <w:r>
-              <w:rPr>
-                <w:rFonts w:ascii="Consolas" w:cs="Consolas" w:eastAsia="Consolas" w:hAnsi="Consolas"/>
-                <w:sz w:val="16"/>
-                <w:szCs w:val="16"/>
-              </w:rPr>
-              <w:t xml:space="preserve">production</w:t>
-            </w:r>
-            <w:r>
-              <w:rPr>
-                <w:rFonts w:ascii="Arial" w:cs="Arial" w:eastAsia="Arial" w:hAnsi="Arial"/>
-                <w:sz w:val="18"/>
-                <w:szCs w:val="18"/>
-              </w:rPr>
-              <w:t xml:space="preserve">).</w:t>
+              <w:t xml:space="preserve">robots.txt</w:t>
+            </w:r>
+            <w:r>
+              <w:rPr>
+                <w:rFonts w:ascii="Arial" w:cs="Arial" w:eastAsia="Arial" w:hAnsi="Arial"/>
+                <w:sz w:val="18"/>
+                <w:szCs w:val="18"/>
+              </w:rPr>
+              <w:t xml:space="preserve"> al compilar.</w:t>
             </w:r>
           </w:p>
         </w:tc>
@@ -9322,7 +9897,7 @@
                 <w:sz w:val="16"/>
                 <w:szCs w:val="16"/>
               </w:rPr>
-              <w:t xml:space="preserve">VITE_API_URL</w:t>
+              <w:t xml:space="preserve">PORT</w:t>
             </w:r>
             <w:r>
               <w:rPr>
@@ -9338,6 +9913,153 @@
                 <w:sz w:val="16"/>
                 <w:szCs w:val="16"/>
               </w:rPr>
+              <w:t xml:space="preserve">NODE_ENV</w:t>
+            </w:r>
+          </w:p>
+        </w:tc>
+        <w:tc>
+          <w:tcPr>
+            <w:tcW w:type="dxa" w:w="1505"/>
+            <w:tcBorders>
+              <w:top w:val="single" w:color="8EA9DB" w:sz="4"/>
+              <w:left w:val="single" w:color="8EA9DB" w:sz="4"/>
+              <w:bottom w:val="single" w:color="8EA9DB" w:sz="4"/>
+              <w:right w:val="single" w:color="8EA9DB" w:sz="4"/>
+            </w:tcBorders>
+            <w:tcMar>
+              <w:top w:type="dxa" w:w="50"/>
+              <w:left w:type="dxa" w:w="90"/>
+              <w:bottom w:type="dxa" w:w="50"/>
+              <w:right w:type="dxa" w:w="90"/>
+            </w:tcMar>
+            <w:vAlign w:val="center"/>
+          </w:tcPr>
+          <w:p>
+            <w:pPr>
+              <w:jc w:val="left"/>
+            </w:pPr>
+            <w:r>
+              <w:rPr>
+                <w:rFonts w:ascii="Arial" w:cs="Arial" w:eastAsia="Arial" w:hAnsi="Arial"/>
+                <w:sz w:val="18"/>
+                <w:szCs w:val="18"/>
+              </w:rPr>
+              <w:t xml:space="preserve">No</w:t>
+            </w:r>
+          </w:p>
+        </w:tc>
+        <w:tc>
+          <w:tcPr>
+            <w:tcW w:type="dxa" w:w="4703"/>
+            <w:tcBorders>
+              <w:top w:val="single" w:color="8EA9DB" w:sz="4"/>
+              <w:left w:val="single" w:color="8EA9DB" w:sz="4"/>
+              <w:bottom w:val="single" w:color="8EA9DB" w:sz="4"/>
+              <w:right w:val="single" w:color="8EA9DB" w:sz="4"/>
+            </w:tcBorders>
+            <w:tcMar>
+              <w:top w:type="dxa" w:w="50"/>
+              <w:left w:type="dxa" w:w="90"/>
+              <w:bottom w:type="dxa" w:w="50"/>
+              <w:right w:type="dxa" w:w="90"/>
+            </w:tcMar>
+            <w:vAlign w:val="center"/>
+          </w:tcPr>
+          <w:p>
+            <w:pPr>
+              <w:jc w:val="left"/>
+            </w:pPr>
+            <w:r>
+              <w:rPr>
+                <w:rFonts w:ascii="Arial" w:cs="Arial" w:eastAsia="Arial" w:hAnsi="Arial"/>
+                <w:sz w:val="18"/>
+                <w:szCs w:val="18"/>
+              </w:rPr>
+              <w:t xml:space="preserve">Puerto del servidor local (3000) y modo (</w:t>
+            </w:r>
+            <w:r>
+              <w:rPr>
+                <w:rFonts w:ascii="Consolas" w:cs="Consolas" w:eastAsia="Consolas" w:hAnsi="Consolas"/>
+                <w:sz w:val="16"/>
+                <w:szCs w:val="16"/>
+              </w:rPr>
+              <w:t xml:space="preserve">development</w:t>
+            </w:r>
+            <w:r>
+              <w:rPr>
+                <w:rFonts w:ascii="Arial" w:cs="Arial" w:eastAsia="Arial" w:hAnsi="Arial"/>
+                <w:sz w:val="18"/>
+                <w:szCs w:val="18"/>
+              </w:rPr>
+              <w:t xml:space="preserve"> o </w:t>
+            </w:r>
+            <w:r>
+              <w:rPr>
+                <w:rFonts w:ascii="Consolas" w:cs="Consolas" w:eastAsia="Consolas" w:hAnsi="Consolas"/>
+                <w:sz w:val="16"/>
+                <w:szCs w:val="16"/>
+              </w:rPr>
+              <w:t xml:space="preserve">production</w:t>
+            </w:r>
+            <w:r>
+              <w:rPr>
+                <w:rFonts w:ascii="Arial" w:cs="Arial" w:eastAsia="Arial" w:hAnsi="Arial"/>
+                <w:sz w:val="18"/>
+                <w:szCs w:val="18"/>
+              </w:rPr>
+              <w:t xml:space="preserve">).</w:t>
+            </w:r>
+          </w:p>
+        </w:tc>
+      </w:tr>
+      <w:tr>
+        <w:trPr>
+          <w:cantSplit/>
+        </w:trPr>
+        <w:tc>
+          <w:tcPr>
+            <w:tcW w:type="dxa" w:w="3198"/>
+            <w:tcBorders>
+              <w:top w:val="single" w:color="8EA9DB" w:sz="4"/>
+              <w:left w:val="single" w:color="8EA9DB" w:sz="4"/>
+              <w:bottom w:val="single" w:color="8EA9DB" w:sz="4"/>
+              <w:right w:val="single" w:color="8EA9DB" w:sz="4"/>
+            </w:tcBorders>
+            <w:shd w:fill="F2F6FC" w:color="auto" w:val="clear"/>
+            <w:tcMar>
+              <w:top w:type="dxa" w:w="50"/>
+              <w:left w:type="dxa" w:w="90"/>
+              <w:bottom w:type="dxa" w:w="50"/>
+              <w:right w:type="dxa" w:w="90"/>
+            </w:tcMar>
+            <w:vAlign w:val="center"/>
+          </w:tcPr>
+          <w:p>
+            <w:pPr>
+              <w:jc w:val="left"/>
+            </w:pPr>
+            <w:r>
+              <w:rPr>
+                <w:rFonts w:ascii="Consolas" w:cs="Consolas" w:eastAsia="Consolas" w:hAnsi="Consolas"/>
+                <w:sz w:val="16"/>
+                <w:szCs w:val="16"/>
+              </w:rPr>
+              <w:t xml:space="preserve">VITE_API_URL</w:t>
+            </w:r>
+            <w:r>
+              <w:rPr>
+                <w:rFonts w:ascii="Arial" w:cs="Arial" w:eastAsia="Arial" w:hAnsi="Arial"/>
+                <w:sz w:val="18"/>
+                <w:szCs w:val="18"/>
+              </w:rPr>
+              <w:t xml:space="preserve"> / </w:t>
+            </w:r>
+            <w:r>
+              <w:rPr>
+                <w:rFonts w:ascii="Consolas" w:cs="Consolas" w:eastAsia="Consolas" w:hAnsi="Consolas"/>
+                <w:sz w:val="16"/>
+                <w:szCs w:val="16"/>
+              </w:rPr>
               <w:t xml:space="preserve">CORS_ORIGIN</w:t>
             </w:r>
           </w:p>
@@ -9351,6 +10073,7 @@
               <w:bottom w:val="single" w:color="8EA9DB" w:sz="4"/>
               <w:right w:val="single" w:color="8EA9DB" w:sz="4"/>
             </w:tcBorders>
+            <w:shd w:fill="F2F6FC" w:color="auto" w:val="clear"/>
             <w:tcMar>
               <w:top w:type="dxa" w:w="50"/>
               <w:left w:type="dxa" w:w="90"/>
@@ -9382,6 +10105,7 @@
               <w:bottom w:val="single" w:color="8EA9DB" w:sz="4"/>
               <w:right w:val="single" w:color="8EA9DB" w:sz="4"/>
             </w:tcBorders>
+            <w:shd w:fill="F2F6FC" w:color="auto" w:val="clear"/>
             <w:tcMar>
               <w:top w:type="dxa" w:w="50"/>
               <w:left w:type="dxa" w:w="90"/>
@@ -10163,7 +10887,7 @@
                 <w:sz w:val="18"/>
                 <w:szCs w:val="18"/>
               </w:rPr>
-              <w:t xml:space="preserve">Ejecuta las 61 pruebas automatizadas con Vitest (precios, reembolsos, disponibilidad, contratos, reportes, cancelaciones, billetera).</w:t>
+              <w:t xml:space="preserve">Ejecuta las 88 pruebas automatizadas con Vitest (precios, reembolsos, disponibilidad, contratos, reportes, cancelaciones, billetera).</w:t>
             </w:r>
           </w:p>
         </w:tc>
@@ -12879,7 +13603,7 @@
                 <w:sz w:val="18"/>
                 <w:szCs w:val="18"/>
               </w:rPr>
-              <w:t xml:space="preserve">Terminan sin errores; Vitest informa 61 pruebas aprobadas.</w:t>
+              <w:t xml:space="preserve">Terminan sin errores; Vitest informa 88 pruebas aprobadas.</w:t>
             </w:r>
           </w:p>
         </w:tc>
@@ -13185,7 +13909,7 @@
                 <w:sz w:val="18"/>
                 <w:szCs w:val="18"/>
               </w:rPr>
-              <w:t xml:space="preserve">Iniciar sesión en </w:t>
+              <w:t xml:space="preserve">Revisar el correo y escribir el código en </w:t>
             </w:r>
             <w:r>
               <w:rPr>
@@ -13193,7 +13917,15 @@
                 <w:sz w:val="16"/>
                 <w:szCs w:val="16"/>
               </w:rPr>
-              <w:t xml:space="preserve">/login</w:t>
+              <w:t xml:space="preserve">/verificar-correo</w:t>
+            </w:r>
+            <w:r>
+              <w:rPr>
+                <w:rFonts w:ascii="Arial" w:cs="Arial" w:eastAsia="Arial" w:hAnsi="Arial"/>
+                <w:sz w:val="18"/>
+                <w:szCs w:val="18"/>
+              </w:rPr>
+              <w:t xml:space="preserve">; luego iniciar sesión</w:t>
             </w:r>
           </w:p>
         </w:tc>
@@ -13224,7 +13956,23 @@
                 <w:sz w:val="18"/>
                 <w:szCs w:val="18"/>
               </w:rPr>
-              <w:t xml:space="preserve">Entra y muestra el nombre en el menú de usuario.</w:t>
+              <w:t xml:space="preserve">Antes del código la cuenta no puede entrar; después entra y muestra el nombre en el menú. En F12 → Application → Cookies aparece </w:t>
+            </w:r>
+            <w:r>
+              <w:rPr>
+                <w:rFonts w:ascii="Consolas" w:cs="Consolas" w:eastAsia="Consolas" w:hAnsi="Consolas"/>
+                <w:sz w:val="16"/>
+                <w:szCs w:val="16"/>
+              </w:rPr>
+              <w:t xml:space="preserve">spotly_rt</w:t>
+            </w:r>
+            <w:r>
+              <w:rPr>
+                <w:rFonts w:ascii="Arial" w:cs="Arial" w:eastAsia="Arial" w:hAnsi="Arial"/>
+                <w:sz w:val="18"/>
+                <w:szCs w:val="18"/>
+              </w:rPr>
+              <w:t xml:space="preserve"> con HttpOnly, Secure y SameSite Strict.</w:t>
             </w:r>
           </w:p>
         </w:tc>
@@ -15516,7 +16264,7 @@
                 <w:sz w:val="18"/>
                 <w:szCs w:val="18"/>
               </w:rPr>
-              <w:t xml:space="preserve">No llega el correo de confirmación</w:t>
+              <w:t xml:space="preserve">No llega el código de verificación</w:t>
             </w:r>
           </w:p>
         </w:tc>
@@ -15548,7 +16296,23 @@
                 <w:sz w:val="18"/>
                 <w:szCs w:val="18"/>
               </w:rPr>
-              <w:t xml:space="preserve">Límite de envíos del SMTP de Supabase</w:t>
+              <w:t xml:space="preserve">Sin </w:t>
+            </w:r>
+            <w:r>
+              <w:rPr>
+                <w:rFonts w:ascii="Consolas" w:cs="Consolas" w:eastAsia="Consolas" w:hAnsi="Consolas"/>
+                <w:sz w:val="16"/>
+                <w:szCs w:val="16"/>
+              </w:rPr>
+              <w:t xml:space="preserve">RESEND_API_KEY</w:t>
+            </w:r>
+            <w:r>
+              <w:rPr>
+                <w:rFonts w:ascii="Arial" w:cs="Arial" w:eastAsia="Arial" w:hAnsi="Arial"/>
+                <w:sz w:val="18"/>
+                <w:szCs w:val="18"/>
+              </w:rPr>
+              <w:t xml:space="preserve"> ni SMTP propio en Supabase</w:t>
             </w:r>
           </w:p>
         </w:tc>
@@ -15580,23 +16344,254 @@
                 <w:sz w:val="18"/>
                 <w:szCs w:val="18"/>
               </w:rPr>
-              <w:t xml:space="preserve">Desactiva </w:t>
-            </w:r>
-            <w:r>
-              <w:rPr>
-                <w:rFonts w:ascii="Arial" w:cs="Arial" w:eastAsia="Arial" w:hAnsi="Arial"/>
-                <w:sz w:val="18"/>
-                <w:szCs w:val="18"/>
-              </w:rPr>
-              <w:t xml:space="preserve">Confirm email</w:t>
-            </w:r>
-            <w:r>
-              <w:rPr>
-                <w:rFonts w:ascii="Arial" w:cs="Arial" w:eastAsia="Arial" w:hAnsi="Arial"/>
-                <w:sz w:val="18"/>
-                <w:szCs w:val="18"/>
-              </w:rPr>
-              <w:t xml:space="preserve"> en desarrollo o configura un SMTP propio (Resend, Amazon SES).</w:t>
+              <w:t xml:space="preserve">Configura Resend (4.6, opción A) o un SMTP propio y la plantilla con </w:t>
+            </w:r>
+            <w:r>
+              <w:rPr>
+                <w:rFonts w:ascii="Consolas" w:cs="Consolas" w:eastAsia="Consolas" w:hAnsi="Consolas"/>
+                <w:sz w:val="16"/>
+                <w:szCs w:val="16"/>
+              </w:rPr>
+              <w:t xml:space="preserve">{{ .Token }}</w:t>
+            </w:r>
+            <w:r>
+              <w:rPr>
+                <w:rFonts w:ascii="Arial" w:cs="Arial" w:eastAsia="Arial" w:hAnsi="Arial"/>
+                <w:sz w:val="18"/>
+                <w:szCs w:val="18"/>
+              </w:rPr>
+              <w:t xml:space="preserve"> (opción B). Revisa spam.</w:t>
+            </w:r>
+          </w:p>
+        </w:tc>
+      </w:tr>
+      <w:tr>
+        <w:trPr>
+          <w:cantSplit/>
+        </w:trPr>
+        <w:tc>
+          <w:tcPr>
+            <w:tcW w:type="dxa" w:w="2822"/>
+            <w:tcBorders>
+              <w:top w:val="single" w:color="8EA9DB" w:sz="4"/>
+              <w:left w:val="single" w:color="8EA9DB" w:sz="4"/>
+              <w:bottom w:val="single" w:color="8EA9DB" w:sz="4"/>
+              <w:right w:val="single" w:color="8EA9DB" w:sz="4"/>
+            </w:tcBorders>
+            <w:tcMar>
+              <w:top w:type="dxa" w:w="50"/>
+              <w:left w:type="dxa" w:w="90"/>
+              <w:bottom w:type="dxa" w:w="50"/>
+              <w:right w:type="dxa" w:w="90"/>
+            </w:tcMar>
+            <w:vAlign w:val="center"/>
+          </w:tcPr>
+          <w:p>
+            <w:pPr>
+              <w:jc w:val="left"/>
+            </w:pPr>
+            <w:r>
+              <w:rPr>
+                <w:rFonts w:ascii="Arial" w:cs="Arial" w:eastAsia="Arial" w:hAnsi="Arial"/>
+                <w:sz w:val="18"/>
+                <w:szCs w:val="18"/>
+              </w:rPr>
+              <w:t xml:space="preserve">Al iniciar sesión dice que el correo no está verificado</w:t>
+            </w:r>
+          </w:p>
+        </w:tc>
+        <w:tc>
+          <w:tcPr>
+            <w:tcW w:type="dxa" w:w="2822"/>
+            <w:tcBorders>
+              <w:top w:val="single" w:color="8EA9DB" w:sz="4"/>
+              <w:left w:val="single" w:color="8EA9DB" w:sz="4"/>
+              <w:bottom w:val="single" w:color="8EA9DB" w:sz="4"/>
+              <w:right w:val="single" w:color="8EA9DB" w:sz="4"/>
+            </w:tcBorders>
+            <w:tcMar>
+              <w:top w:type="dxa" w:w="50"/>
+              <w:left w:type="dxa" w:w="90"/>
+              <w:bottom w:type="dxa" w:w="50"/>
+              <w:right w:type="dxa" w:w="90"/>
+            </w:tcMar>
+            <w:vAlign w:val="center"/>
+          </w:tcPr>
+          <w:p>
+            <w:pPr>
+              <w:jc w:val="left"/>
+            </w:pPr>
+            <w:r>
+              <w:rPr>
+                <w:rFonts w:ascii="Arial" w:cs="Arial" w:eastAsia="Arial" w:hAnsi="Arial"/>
+                <w:sz w:val="18"/>
+                <w:szCs w:val="18"/>
+              </w:rPr>
+              <w:t xml:space="preserve">La cuenta no ingresó el código</w:t>
+            </w:r>
+          </w:p>
+        </w:tc>
+        <w:tc>
+          <w:tcPr>
+            <w:tcW w:type="dxa" w:w="3762"/>
+            <w:tcBorders>
+              <w:top w:val="single" w:color="8EA9DB" w:sz="4"/>
+              <w:left w:val="single" w:color="8EA9DB" w:sz="4"/>
+              <w:bottom w:val="single" w:color="8EA9DB" w:sz="4"/>
+              <w:right w:val="single" w:color="8EA9DB" w:sz="4"/>
+            </w:tcBorders>
+            <w:tcMar>
+              <w:top w:type="dxa" w:w="50"/>
+              <w:left w:type="dxa" w:w="90"/>
+              <w:bottom w:type="dxa" w:w="50"/>
+              <w:right w:type="dxa" w:w="90"/>
+            </w:tcMar>
+            <w:vAlign w:val="center"/>
+          </w:tcPr>
+          <w:p>
+            <w:pPr>
+              <w:jc w:val="left"/>
+            </w:pPr>
+            <w:r>
+              <w:rPr>
+                <w:rFonts w:ascii="Arial" w:cs="Arial" w:eastAsia="Arial" w:hAnsi="Arial"/>
+                <w:sz w:val="18"/>
+                <w:szCs w:val="18"/>
+              </w:rPr>
+              <w:t xml:space="preserve">Presiona </w:t>
+            </w:r>
+            <w:r>
+              <w:rPr>
+                <w:rFonts w:ascii="Arial" w:cs="Arial" w:eastAsia="Arial" w:hAnsi="Arial"/>
+                <w:sz w:val="18"/>
+                <w:szCs w:val="18"/>
+              </w:rPr>
+              <w:t xml:space="preserve">Verificar mi correo</w:t>
+            </w:r>
+            <w:r>
+              <w:rPr>
+                <w:rFonts w:ascii="Arial" w:cs="Arial" w:eastAsia="Arial" w:hAnsi="Arial"/>
+                <w:sz w:val="18"/>
+                <w:szCs w:val="18"/>
+              </w:rPr>
+              <w:t xml:space="preserve">: se envía un código nuevo.</w:t>
+            </w:r>
+          </w:p>
+        </w:tc>
+      </w:tr>
+      <w:tr>
+        <w:trPr>
+          <w:cantSplit/>
+        </w:trPr>
+        <w:tc>
+          <w:tcPr>
+            <w:tcW w:type="dxa" w:w="2822"/>
+            <w:tcBorders>
+              <w:top w:val="single" w:color="8EA9DB" w:sz="4"/>
+              <w:left w:val="single" w:color="8EA9DB" w:sz="4"/>
+              <w:bottom w:val="single" w:color="8EA9DB" w:sz="4"/>
+              <w:right w:val="single" w:color="8EA9DB" w:sz="4"/>
+            </w:tcBorders>
+            <w:shd w:fill="F2F6FC" w:color="auto" w:val="clear"/>
+            <w:tcMar>
+              <w:top w:type="dxa" w:w="50"/>
+              <w:left w:type="dxa" w:w="90"/>
+              <w:bottom w:type="dxa" w:w="50"/>
+              <w:right w:type="dxa" w:w="90"/>
+            </w:tcMar>
+            <w:vAlign w:val="center"/>
+          </w:tcPr>
+          <w:p>
+            <w:pPr>
+              <w:jc w:val="left"/>
+            </w:pPr>
+            <w:r>
+              <w:rPr>
+                <w:rFonts w:ascii="Arial" w:cs="Arial" w:eastAsia="Arial" w:hAnsi="Arial"/>
+                <w:sz w:val="18"/>
+                <w:szCs w:val="18"/>
+              </w:rPr>
+              <w:t xml:space="preserve">La sesión se pierde al recargar</w:t>
+            </w:r>
+          </w:p>
+        </w:tc>
+        <w:tc>
+          <w:tcPr>
+            <w:tcW w:type="dxa" w:w="2822"/>
+            <w:tcBorders>
+              <w:top w:val="single" w:color="8EA9DB" w:sz="4"/>
+              <w:left w:val="single" w:color="8EA9DB" w:sz="4"/>
+              <w:bottom w:val="single" w:color="8EA9DB" w:sz="4"/>
+              <w:right w:val="single" w:color="8EA9DB" w:sz="4"/>
+            </w:tcBorders>
+            <w:shd w:fill="F2F6FC" w:color="auto" w:val="clear"/>
+            <w:tcMar>
+              <w:top w:type="dxa" w:w="50"/>
+              <w:left w:type="dxa" w:w="90"/>
+              <w:bottom w:type="dxa" w:w="50"/>
+              <w:right w:type="dxa" w:w="90"/>
+            </w:tcMar>
+            <w:vAlign w:val="center"/>
+          </w:tcPr>
+          <w:p>
+            <w:pPr>
+              <w:jc w:val="left"/>
+            </w:pPr>
+            <w:r>
+              <w:rPr>
+                <w:rFonts w:ascii="Arial" w:cs="Arial" w:eastAsia="Arial" w:hAnsi="Arial"/>
+                <w:sz w:val="18"/>
+                <w:szCs w:val="18"/>
+              </w:rPr>
+              <w:t xml:space="preserve">La web y la API están en dominios distintos</w:t>
+            </w:r>
+          </w:p>
+        </w:tc>
+        <w:tc>
+          <w:tcPr>
+            <w:tcW w:type="dxa" w:w="3762"/>
+            <w:tcBorders>
+              <w:top w:val="single" w:color="8EA9DB" w:sz="4"/>
+              <w:left w:val="single" w:color="8EA9DB" w:sz="4"/>
+              <w:bottom w:val="single" w:color="8EA9DB" w:sz="4"/>
+              <w:right w:val="single" w:color="8EA9DB" w:sz="4"/>
+            </w:tcBorders>
+            <w:shd w:fill="F2F6FC" w:color="auto" w:val="clear"/>
+            <w:tcMar>
+              <w:top w:type="dxa" w:w="50"/>
+              <w:left w:type="dxa" w:w="90"/>
+              <w:bottom w:type="dxa" w:w="50"/>
+              <w:right w:type="dxa" w:w="90"/>
+            </w:tcMar>
+            <w:vAlign w:val="center"/>
+          </w:tcPr>
+          <w:p>
+            <w:pPr>
+              <w:jc w:val="left"/>
+            </w:pPr>
+            <w:r>
+              <w:rPr>
+                <w:rFonts w:ascii="Arial" w:cs="Arial" w:eastAsia="Arial" w:hAnsi="Arial"/>
+                <w:sz w:val="18"/>
+                <w:szCs w:val="18"/>
+              </w:rPr>
+              <w:t xml:space="preserve">Publica ambas en el mismo dominio o define </w:t>
+            </w:r>
+            <w:r>
+              <w:rPr>
+                <w:rFonts w:ascii="Consolas" w:cs="Consolas" w:eastAsia="Consolas" w:hAnsi="Consolas"/>
+                <w:sz w:val="16"/>
+                <w:szCs w:val="16"/>
+              </w:rPr>
+              <w:t xml:space="preserve">CORS_ORIGIN</w:t>
+            </w:r>
+            <w:r>
+              <w:rPr>
+                <w:rFonts w:ascii="Arial" w:cs="Arial" w:eastAsia="Arial" w:hAnsi="Arial"/>
+                <w:sz w:val="18"/>
+                <w:szCs w:val="18"/>
+              </w:rPr>
+              <w:t xml:space="preserve"> con el dominio exacto del frontend.</w:t>
             </w:r>
           </w:p>
         </w:tc>

</xml_diff>